<commit_message>
fix: implement valid positive number for duration
</commit_message>
<xml_diff>
--- a/report.docx
+++ b/report.docx
@@ -724,7 +724,15 @@
         <w:ind w:left="720"/>
       </w:pPr>
       <w:r>
-        <w:t>Step 3: Else print header + iterate list, print each student.toString()</w:t>
+        <w:t xml:space="preserve">Step 3: Else print header + iterate list, print each </w:t>
+      </w:r>
+      <w:proofErr w:type="gramStart"/>
+      <w:r>
+        <w:t>student.toString</w:t>
+      </w:r>
+      <w:proofErr w:type="gramEnd"/>
+      <w:r>
+        <w:t>()</w:t>
       </w:r>
     </w:p>
     <w:p>
@@ -760,7 +768,15 @@
       </w:pPr>
       <w:r>
         <w:lastRenderedPageBreak/>
-        <w:t>Step 2: Validate format STU#### (regex ^STU\d{4}$)</w:t>
+        <w:t>Step 2: Validate format STU#### (regex ^STU\</w:t>
+      </w:r>
+      <w:proofErr w:type="gramStart"/>
+      <w:r>
+        <w:t>d{</w:t>
+      </w:r>
+      <w:proofErr w:type="gramEnd"/>
+      <w:r>
+        <w:t>4}$)</w:t>
       </w:r>
     </w:p>
     <w:p>
@@ -1178,7 +1194,15 @@
         <w:ind w:left="720"/>
       </w:pPr>
       <w:r>
-        <w:t>Step 9: student.setName(), setMajor(), setGpa()</w:t>
+        <w:t xml:space="preserve">Step 9: </w:t>
+      </w:r>
+      <w:proofErr w:type="gramStart"/>
+      <w:r>
+        <w:t>student.setName</w:t>
+      </w:r>
+      <w:proofErr w:type="gramEnd"/>
+      <w:r>
+        <w:t>(), setMajor(), setGpa()</w:t>
       </w:r>
     </w:p>
     <w:p>
@@ -1584,7 +1608,15 @@
       </w:pPr>
       <w:r>
         <w:lastRenderedPageBreak/>
-        <w:t xml:space="preserve">         If studentId != prevStudentId:</w:t>
+        <w:t xml:space="preserve">         If </w:t>
+      </w:r>
+      <w:proofErr w:type="gramStart"/>
+      <w:r>
+        <w:t>studentId !</w:t>
+      </w:r>
+      <w:proofErr w:type="gramEnd"/>
+      <w:r>
+        <w:t>= prevStudentId:</w:t>
       </w:r>
     </w:p>
     <w:p>
@@ -2225,7 +2257,21 @@
         <w:rPr>
           <w:rFonts w:hint="eastAsia"/>
         </w:rPr>
-        <w:t xml:space="preserve"> saveAll(courseDAO, studentDAO), print "Good bye", System.exit(0)</w:t>
+        <w:t xml:space="preserve"> </w:t>
+      </w:r>
+      <w:proofErr w:type="gramStart"/>
+      <w:r>
+        <w:rPr>
+          <w:rFonts w:hint="eastAsia"/>
+        </w:rPr>
+        <w:t>saveAll(</w:t>
+      </w:r>
+      <w:proofErr w:type="gramEnd"/>
+      <w:r>
+        <w:rPr>
+          <w:rFonts w:hint="eastAsia"/>
+        </w:rPr>
+        <w:t>courseDAO, studentDAO), print "Good bye", System.exit(0)</w:t>
       </w:r>
     </w:p>
     <w:p>
@@ -3490,6 +3536,160 @@
         <w:t>Search for a non-existent student ID.</w:t>
       </w:r>
     </w:p>
+    <w:p/>
+    <w:p>
+      <w:pPr>
+        <w:keepNext/>
+        <w:jc w:val="center"/>
+      </w:pPr>
+      <w:r>
+        <w:drawing>
+          <wp:inline distT="0" distB="0" distL="0" distR="0" wp14:anchorId="70DE2D38" wp14:editId="1679C3B1">
+            <wp:extent cx="5151566" cy="2819644"/>
+            <wp:effectExtent l="0" t="0" r="0" b="0"/>
+            <wp:docPr id="15" name="Picture 15"/>
+            <wp:cNvGraphicFramePr>
+              <a:graphicFrameLocks xmlns:a="http://schemas.openxmlformats.org/drawingml/2006/main" noChangeAspect="1"/>
+            </wp:cNvGraphicFramePr>
+            <a:graphic xmlns:a="http://schemas.openxmlformats.org/drawingml/2006/main">
+              <a:graphicData uri="http://schemas.openxmlformats.org/drawingml/2006/picture">
+                <pic:pic xmlns:pic="http://schemas.openxmlformats.org/drawingml/2006/picture">
+                  <pic:nvPicPr>
+                    <pic:cNvPr id="1" name=""/>
+                    <pic:cNvPicPr/>
+                  </pic:nvPicPr>
+                  <pic:blipFill>
+                    <a:blip r:embed="rId17"/>
+                    <a:stretch>
+                      <a:fillRect/>
+                    </a:stretch>
+                  </pic:blipFill>
+                  <pic:spPr>
+                    <a:xfrm>
+                      <a:off x="0" y="0"/>
+                      <a:ext cx="5151566" cy="2819644"/>
+                    </a:xfrm>
+                    <a:prstGeom prst="rect">
+                      <a:avLst/>
+                    </a:prstGeom>
+                  </pic:spPr>
+                </pic:pic>
+              </a:graphicData>
+            </a:graphic>
+          </wp:inline>
+        </w:drawing>
+      </w:r>
+    </w:p>
+    <w:p>
+      <w:pPr>
+        <w:pStyle w:val="Caption"/>
+        <w:jc w:val="center"/>
+      </w:pPr>
+      <w:r>
+        <w:t xml:space="preserve">Figure </w:t>
+      </w:r>
+      <w:r>
+        <w:fldChar w:fldCharType="begin"/>
+      </w:r>
+      <w:r>
+        <w:instrText xml:space="preserve"> SEQ Figure \* ARABIC </w:instrText>
+      </w:r>
+      <w:r>
+        <w:fldChar w:fldCharType="separate"/>
+      </w:r>
+      <w:r>
+        <w:rPr>
+          <w:noProof/>
+        </w:rPr>
+        <w:t>12</w:t>
+      </w:r>
+      <w:r>
+        <w:fldChar w:fldCharType="end"/>
+      </w:r>
+      <w:r>
+        <w:t xml:space="preserve">: </w:t>
+      </w:r>
+      <w:r>
+        <w:t>Add a course with past start date</w:t>
+      </w:r>
+    </w:p>
+    <w:p>
+      <w:pPr>
+        <w:keepNext/>
+        <w:jc w:val="center"/>
+      </w:pPr>
+      <w:r>
+        <w:lastRenderedPageBreak/>
+        <w:drawing>
+          <wp:inline distT="0" distB="0" distL="0" distR="0" wp14:anchorId="471F0BC3" wp14:editId="598D1699">
+            <wp:extent cx="5486400" cy="2466340"/>
+            <wp:effectExtent l="0" t="0" r="0" b="0"/>
+            <wp:docPr id="16" name="Picture 16"/>
+            <wp:cNvGraphicFramePr>
+              <a:graphicFrameLocks xmlns:a="http://schemas.openxmlformats.org/drawingml/2006/main" noChangeAspect="1"/>
+            </wp:cNvGraphicFramePr>
+            <a:graphic xmlns:a="http://schemas.openxmlformats.org/drawingml/2006/main">
+              <a:graphicData uri="http://schemas.openxmlformats.org/drawingml/2006/picture">
+                <pic:pic xmlns:pic="http://schemas.openxmlformats.org/drawingml/2006/picture">
+                  <pic:nvPicPr>
+                    <pic:cNvPr id="1" name=""/>
+                    <pic:cNvPicPr/>
+                  </pic:nvPicPr>
+                  <pic:blipFill>
+                    <a:blip r:embed="rId18"/>
+                    <a:stretch>
+                      <a:fillRect/>
+                    </a:stretch>
+                  </pic:blipFill>
+                  <pic:spPr>
+                    <a:xfrm>
+                      <a:off x="0" y="0"/>
+                      <a:ext cx="5486400" cy="2466340"/>
+                    </a:xfrm>
+                    <a:prstGeom prst="rect">
+                      <a:avLst/>
+                    </a:prstGeom>
+                  </pic:spPr>
+                </pic:pic>
+              </a:graphicData>
+            </a:graphic>
+          </wp:inline>
+        </w:drawing>
+      </w:r>
+    </w:p>
+    <w:p>
+      <w:pPr>
+        <w:pStyle w:val="Caption"/>
+        <w:jc w:val="center"/>
+      </w:pPr>
+      <w:r>
+        <w:t xml:space="preserve">Figure </w:t>
+      </w:r>
+      <w:r>
+        <w:fldChar w:fldCharType="begin"/>
+      </w:r>
+      <w:r>
+        <w:instrText xml:space="preserve"> SEQ Figure \* ARABIC </w:instrText>
+      </w:r>
+      <w:r>
+        <w:fldChar w:fldCharType="separate"/>
+      </w:r>
+      <w:r>
+        <w:rPr>
+          <w:noProof/>
+        </w:rPr>
+        <w:t>13</w:t>
+      </w:r>
+      <w:r>
+        <w:fldChar w:fldCharType="end"/>
+      </w:r>
+      <w:r>
+        <w:t xml:space="preserve">: </w:t>
+      </w:r>
+      <w:r>
+        <w:t>Add a course with invalid duration</w:t>
+      </w:r>
+    </w:p>
     <w:p>
       <w:pPr>
         <w:pStyle w:val="Heading2"/>
@@ -3514,11 +3714,16 @@
         <w:spacing w:before="120" w:after="120" w:line="360" w:lineRule="atLeast"/>
       </w:pPr>
       <w:r>
-        <w:t>Source files: Brand.java, Car.java, BrandManager.java, CarManager.java, FileHandler.java, Main.java</w:t>
+        <w:t xml:space="preserve">Source files: Brand.java, Car.java, BrandManager.java, CarManager.java, FileHandler.java, </w:t>
+      </w:r>
+      <w:proofErr w:type="gramStart"/>
+      <w:r>
+        <w:t>Main.java</w:t>
       </w:r>
       <w:r>
         <w:t>,…</w:t>
       </w:r>
+      <w:proofErr w:type="gramEnd"/>
     </w:p>
     <w:p>
       <w:pPr>

</xml_diff>